<commit_message>
se las tablas de funcionalidades de procesos
</commit_message>
<xml_diff>
--- a/IntegradorII/BOA.docx
+++ b/IntegradorII/BOA.docx
@@ -872,6 +872,8 @@
           <w:rFonts w:ascii="Trebuchet MS" w:hAnsi="Trebuchet MS"/>
           <w:b/>
           <w:bCs/>
+          <w:sz w:val="24"/>
+          <w:szCs w:val="24"/>
         </w:rPr>
       </w:pPr>
       <w:r>
@@ -879,6 +881,8 @@
           <w:rFonts w:ascii="Trebuchet MS" w:hAnsi="Trebuchet MS"/>
           <w:b/>
           <w:bCs/>
+          <w:sz w:val="24"/>
+          <w:szCs w:val="24"/>
         </w:rPr>
         <w:lastRenderedPageBreak/>
         <w:t>Caso de estudio.</w:t>
@@ -4251,6 +4255,9 @@
       </w:drawing>
     </w:r>
     <w:r>
+      <w:rPr>
+        <w:noProof/>
+      </w:rPr>
       <w:drawing>
         <wp:anchor distT="0" distB="0" distL="114300" distR="114300" simplePos="0" relativeHeight="251659264" behindDoc="1" locked="0" layoutInCell="1" allowOverlap="1" wp14:anchorId="03F4647F" wp14:editId="3DD233D1">
           <wp:simplePos x="0" y="0"/>
@@ -5291,6 +5298,7 @@
   <w:style w:type="character" w:default="1" w:styleId="Fuentedeprrafopredeter">
     <w:name w:val="Default Paragraph Font"/>
     <w:uiPriority w:val="1"/>
+    <w:semiHidden/>
     <w:unhideWhenUsed/>
   </w:style>
   <w:style w:type="table" w:default="1" w:styleId="Tablanormal">

</xml_diff>

<commit_message>
se agrega las imagenes de figma
</commit_message>
<xml_diff>
--- a/IntegradorII/BOA.docx
+++ b/IntegradorII/BOA.docx
@@ -171,33 +171,7 @@
           <w:szCs w:val="24"/>
           <w:lang w:eastAsia="es-NI"/>
         </w:rPr>
-        <w:t>“</w:t>
-      </w:r>
-      <w:proofErr w:type="gramStart"/>
-      <w:r>
-        <w:rPr>
-          <w:rFonts w:ascii="Times New Roman" w:eastAsia="Times New Roman" w:hAnsi="Times New Roman" w:cs="Times New Roman"/>
-          <w:i/>
-          <w:iCs/>
-          <w:color w:val="000000"/>
-          <w:sz w:val="24"/>
-          <w:szCs w:val="24"/>
-          <w:lang w:eastAsia="es-NI"/>
-        </w:rPr>
-        <w:t>2026:Una</w:t>
-      </w:r>
-      <w:proofErr w:type="gramEnd"/>
-      <w:r>
-        <w:rPr>
-          <w:rFonts w:ascii="Times New Roman" w:eastAsia="Times New Roman" w:hAnsi="Times New Roman" w:cs="Times New Roman"/>
-          <w:i/>
-          <w:iCs/>
-          <w:color w:val="000000"/>
-          <w:sz w:val="24"/>
-          <w:szCs w:val="24"/>
-          <w:lang w:eastAsia="es-NI"/>
-        </w:rPr>
-        <w:t xml:space="preserve"> educación al servicio del pueblo, ¡Viva Sandino!”</w:t>
+        <w:t>“2026:Una educación al servicio del pueblo, ¡Viva Sandino!”</w:t>
       </w:r>
     </w:p>
     <w:p>
@@ -447,20 +421,8 @@
           <w:szCs w:val="24"/>
           <w:lang w:eastAsia="es-NI"/>
         </w:rPr>
-        <w:t xml:space="preserve">Eliezer Antonio Suarez </w:t>
+        <w:t>Eliezer Antonio Suarez Gomez</w:t>
       </w:r>
-      <w:proofErr w:type="spellStart"/>
-      <w:r>
-        <w:rPr>
-          <w:rFonts w:ascii="Times New Roman" w:eastAsia="Times New Roman" w:hAnsi="Times New Roman" w:cs="Times New Roman"/>
-          <w:color w:val="000000"/>
-          <w:sz w:val="24"/>
-          <w:szCs w:val="24"/>
-          <w:lang w:eastAsia="es-NI"/>
-        </w:rPr>
-        <w:t>Gomez</w:t>
-      </w:r>
-      <w:proofErr w:type="spellEnd"/>
     </w:p>
     <w:p>
       <w:pPr>
@@ -487,29 +449,7 @@
           <w:szCs w:val="24"/>
           <w:lang w:eastAsia="es-NI"/>
         </w:rPr>
-        <w:t xml:space="preserve">Pedro Maximiliano Ortega </w:t>
-      </w:r>
-      <w:proofErr w:type="spellStart"/>
-      <w:r>
-        <w:rPr>
-          <w:rFonts w:ascii="Times New Roman" w:eastAsia="Times New Roman" w:hAnsi="Times New Roman" w:cs="Times New Roman"/>
-          <w:color w:val="000000"/>
-          <w:sz w:val="24"/>
-          <w:szCs w:val="24"/>
-          <w:lang w:eastAsia="es-NI"/>
-        </w:rPr>
-        <w:t>Mejia</w:t>
-      </w:r>
-      <w:proofErr w:type="spellEnd"/>
-      <w:r>
-        <w:rPr>
-          <w:rFonts w:ascii="Times New Roman" w:eastAsia="Times New Roman" w:hAnsi="Times New Roman" w:cs="Times New Roman"/>
-          <w:color w:val="000000"/>
-          <w:sz w:val="24"/>
-          <w:szCs w:val="24"/>
-          <w:lang w:eastAsia="es-NI"/>
-        </w:rPr>
-        <w:t>.</w:t>
+        <w:t>Pedro Maximiliano Ortega Mejia.</w:t>
       </w:r>
     </w:p>
     <w:p>
@@ -628,51 +568,7 @@
           <w:szCs w:val="24"/>
           <w:lang w:eastAsia="es-NI"/>
         </w:rPr>
-        <w:t xml:space="preserve">Yesenia </w:t>
-      </w:r>
-      <w:proofErr w:type="spellStart"/>
-      <w:r>
-        <w:rPr>
-          <w:rFonts w:ascii="Times New Roman" w:eastAsia="Times New Roman" w:hAnsi="Times New Roman" w:cs="Times New Roman"/>
-          <w:color w:val="000000"/>
-          <w:sz w:val="24"/>
-          <w:szCs w:val="24"/>
-          <w:lang w:eastAsia="es-NI"/>
-        </w:rPr>
-        <w:t>Sobeyda</w:t>
-      </w:r>
-      <w:proofErr w:type="spellEnd"/>
-      <w:r>
-        <w:rPr>
-          <w:rFonts w:ascii="Times New Roman" w:eastAsia="Times New Roman" w:hAnsi="Times New Roman" w:cs="Times New Roman"/>
-          <w:color w:val="000000"/>
-          <w:sz w:val="24"/>
-          <w:szCs w:val="24"/>
-          <w:lang w:eastAsia="es-NI"/>
-        </w:rPr>
-        <w:t xml:space="preserve"> Téllez </w:t>
-      </w:r>
-      <w:proofErr w:type="spellStart"/>
-      <w:r>
-        <w:rPr>
-          <w:rFonts w:ascii="Times New Roman" w:eastAsia="Times New Roman" w:hAnsi="Times New Roman" w:cs="Times New Roman"/>
-          <w:color w:val="000000"/>
-          <w:sz w:val="24"/>
-          <w:szCs w:val="24"/>
-          <w:lang w:eastAsia="es-NI"/>
-        </w:rPr>
-        <w:t>Gomez</w:t>
-      </w:r>
-      <w:proofErr w:type="spellEnd"/>
-      <w:r>
-        <w:rPr>
-          <w:rFonts w:ascii="Times New Roman" w:eastAsia="Times New Roman" w:hAnsi="Times New Roman" w:cs="Times New Roman"/>
-          <w:color w:val="000000"/>
-          <w:sz w:val="24"/>
-          <w:szCs w:val="24"/>
-          <w:lang w:eastAsia="es-NI"/>
-        </w:rPr>
-        <w:t> </w:t>
+        <w:t>Yesenia Sobeyda Téllez Gomez </w:t>
       </w:r>
     </w:p>
     <w:p>
@@ -700,29 +596,7 @@
           <w:szCs w:val="24"/>
           <w:lang w:eastAsia="es-NI"/>
         </w:rPr>
-        <w:t xml:space="preserve">María </w:t>
-      </w:r>
-      <w:proofErr w:type="spellStart"/>
-      <w:r>
-        <w:rPr>
-          <w:rFonts w:ascii="Times New Roman" w:eastAsia="Times New Roman" w:hAnsi="Times New Roman" w:cs="Times New Roman"/>
-          <w:color w:val="000000"/>
-          <w:sz w:val="24"/>
-          <w:szCs w:val="24"/>
-          <w:lang w:eastAsia="es-NI"/>
-        </w:rPr>
-        <w:t>Jorlenis</w:t>
-      </w:r>
-      <w:proofErr w:type="spellEnd"/>
-      <w:r>
-        <w:rPr>
-          <w:rFonts w:ascii="Times New Roman" w:eastAsia="Times New Roman" w:hAnsi="Times New Roman" w:cs="Times New Roman"/>
-          <w:color w:val="000000"/>
-          <w:sz w:val="24"/>
-          <w:szCs w:val="24"/>
-          <w:lang w:eastAsia="es-NI"/>
-        </w:rPr>
-        <w:t xml:space="preserve"> Ríos Pérez</w:t>
+        <w:t>María Jorlenis Ríos Pérez</w:t>
       </w:r>
     </w:p>
     <w:p>
@@ -750,29 +624,7 @@
           <w:szCs w:val="24"/>
           <w:lang w:eastAsia="es-NI"/>
         </w:rPr>
-        <w:t xml:space="preserve">Isamar Del Socorro Bonilla </w:t>
-      </w:r>
-      <w:proofErr w:type="spellStart"/>
-      <w:r>
-        <w:rPr>
-          <w:rFonts w:ascii="Times New Roman" w:eastAsia="Times New Roman" w:hAnsi="Times New Roman" w:cs="Times New Roman"/>
-          <w:color w:val="000000"/>
-          <w:sz w:val="24"/>
-          <w:szCs w:val="24"/>
-          <w:lang w:eastAsia="es-NI"/>
-        </w:rPr>
-        <w:t>Martinez</w:t>
-      </w:r>
-      <w:proofErr w:type="spellEnd"/>
-      <w:r>
-        <w:rPr>
-          <w:rFonts w:ascii="Times New Roman" w:eastAsia="Times New Roman" w:hAnsi="Times New Roman" w:cs="Times New Roman"/>
-          <w:color w:val="000000"/>
-          <w:sz w:val="24"/>
-          <w:szCs w:val="24"/>
-          <w:lang w:eastAsia="es-NI"/>
-        </w:rPr>
-        <w:t> </w:t>
+        <w:t>Isamar Del Socorro Bonilla Martinez </w:t>
       </w:r>
     </w:p>
     <w:p>
@@ -1494,10 +1346,12 @@
           <w:szCs w:val="24"/>
           <w:lang w:eastAsia="es-NI"/>
         </w:rPr>
-        <w:t xml:space="preserve"> tienen </w:t>
+        <w:t xml:space="preserve"> tienen acceso estudiantes desde nivel de primaria hasta secundaria, está desempeñando un papel fundamental para el acceso a recursos educativos. Sin embargo, actualmente la gestión de la información se realiza mediante un sistema mixto, combinando registros manuales en papel con archivos digitales básicos de inventario, lo que genera diversas limitaciones en el control y organización de los recursos.</w:t>
       </w:r>
-      <w:proofErr w:type="gramStart"/>
-      <w:r>
+    </w:p>
+    <w:p>
+      <w:pPr>
+        <w:spacing w:after="0" w:line="240" w:lineRule="auto"/>
         <w:rPr>
           <w:rFonts w:ascii="Trebuchet MS" w:eastAsia="Times New Roman" w:hAnsi="Trebuchet MS" w:cs="Times New Roman"/>
           <w:color w:val="000000"/>
@@ -1505,9 +1359,7 @@
           <w:szCs w:val="24"/>
           <w:lang w:eastAsia="es-NI"/>
         </w:rPr>
-        <w:t>acceso estudiantes</w:t>
-      </w:r>
-      <w:proofErr w:type="gramEnd"/>
+      </w:pPr>
       <w:r>
         <w:rPr>
           <w:rFonts w:ascii="Trebuchet MS" w:eastAsia="Times New Roman" w:hAnsi="Trebuchet MS" w:cs="Times New Roman"/>
@@ -1516,51 +1368,7 @@
           <w:szCs w:val="24"/>
           <w:lang w:eastAsia="es-NI"/>
         </w:rPr>
-        <w:t xml:space="preserve"> desde nivel de primaria hasta secundaria, está desempeñando un papel fundamental para el acceso a recursos educativos. Sin embargo, actualmente la gestión de la información se realiza mediante un sistema mixto, combinando registros manuales en papel con archivos digitales básicos de inventario, lo que genera diversas limitaciones en el control y organización de los recursos.</w:t>
-      </w:r>
-    </w:p>
-    <w:p>
-      <w:pPr>
-        <w:spacing w:after="0" w:line="240" w:lineRule="auto"/>
-        <w:rPr>
-          <w:rFonts w:ascii="Trebuchet MS" w:eastAsia="Times New Roman" w:hAnsi="Trebuchet MS" w:cs="Times New Roman"/>
-          <w:color w:val="000000"/>
-          <w:sz w:val="24"/>
-          <w:szCs w:val="24"/>
-          <w:lang w:eastAsia="es-NI"/>
-        </w:rPr>
-      </w:pPr>
-      <w:r>
-        <w:rPr>
-          <w:rFonts w:ascii="Trebuchet MS" w:eastAsia="Times New Roman" w:hAnsi="Trebuchet MS" w:cs="Times New Roman"/>
-          <w:color w:val="000000"/>
-          <w:sz w:val="24"/>
-          <w:szCs w:val="24"/>
-          <w:lang w:eastAsia="es-NI"/>
-        </w:rPr>
-        <w:t xml:space="preserve">El proceso de registro de libros incluye información detallada como fecha de ingreso, autor, editorial, lugar y fecha de edición, precio y observaciones, además del uso del sistema de clasificación Dewey y la asignación de signaturas tipográficas para su identificación. A pesar de contar con estos métodos, el control de préstamos y devoluciones se realiza de forma manual mediante registros mensuales, lo que dificulta conocer en tiempo real la disponibilidad de los libros. Esta situación provoca múltiples problemas entre ellos riesgo de </w:t>
-      </w:r>
-      <w:proofErr w:type="spellStart"/>
-      <w:r>
-        <w:rPr>
-          <w:rFonts w:ascii="Trebuchet MS" w:eastAsia="Times New Roman" w:hAnsi="Trebuchet MS" w:cs="Times New Roman"/>
-          <w:color w:val="000000"/>
-          <w:sz w:val="24"/>
-          <w:szCs w:val="24"/>
-          <w:lang w:eastAsia="es-NI"/>
-        </w:rPr>
-        <w:t>perdida</w:t>
-      </w:r>
-      <w:proofErr w:type="spellEnd"/>
-      <w:r>
-        <w:rPr>
-          <w:rFonts w:ascii="Trebuchet MS" w:eastAsia="Times New Roman" w:hAnsi="Trebuchet MS" w:cs="Times New Roman"/>
-          <w:color w:val="000000"/>
-          <w:sz w:val="24"/>
-          <w:szCs w:val="24"/>
-          <w:lang w:eastAsia="es-NI"/>
-        </w:rPr>
-        <w:t xml:space="preserve"> o deterioro de información, errores en el registro de datos, dificultad para localizar libros de manera rápida, deficiencia en el control de préstamos y devoluciones y retraso en la atención de los estudiantes.</w:t>
+        <w:t>El proceso de registro de libros incluye información detallada como fecha de ingreso, autor, editorial, lugar y fecha de edición y observaciones, además del uso del sistema de clasificación Dewey y la asignación de signaturas tipográficas para su identificación. A pesar de contar con estos métodos, el control de préstamos y devoluciones se realiza de forma manual mediante registros mensuales, lo que dificulta conocer en tiempo real la disponibilidad de los libros. Esta situación provoca múltiples problemas entre ellos riesgo de perdida o deterioro de información, errores en el registro de datos, dificultad para localizar libros de manera rápida, deficiencia en el control de préstamos y devoluciones y retraso en la atención de los estudiantes.</w:t>
       </w:r>
     </w:p>
     <w:p>

</xml_diff>